<commit_message>
Add requirement-to-component traceability for the SAD; correct SRS dates to 2026
</commit_message>
<xml_diff>
--- a/docs/SRS_Bank_Management_System_v1.0.docx
+++ b/docs/SRS_Bank_Management_System_v1.0.docx
@@ -42,7 +42,7 @@
         <w:br/>
       </w:r>
       <w:r>
-        <w:t>Date: 05-09-2025</w:t>
+        <w:t>Date: 05-09-2026</w:t>
       </w:r>
       <w:r>
         <w:br/>
@@ -209,7 +209,7 @@
                 <w:b w:val="0"/>
                 <w:sz w:val="16"/>
               </w:rPr>
-              <w:t>04-09-2025</w:t>
+              <w:t>04-09-2026</w:t>
             </w:r>
           </w:p>
         </w:tc>
@@ -301,7 +301,7 @@
                 <w:b w:val="0"/>
                 <w:sz w:val="16"/>
               </w:rPr>
-              <w:t>05-09-2025</w:t>
+              <w:t>05-09-2026</w:t>
             </w:r>
           </w:p>
         </w:tc>

</xml_diff>